<commit_message>
Draft v94 of appellate briefs integrating gap analysis feedback
</commit_message>
<xml_diff>
--- a/Output/appellate_argument_v94_Brief.docx
+++ b/Output/appellate_argument_v94_Brief.docx
@@ -3141,7 +3141,7 @@
           <w:sz w:val="20"/>
           <w:szCs w:val="20"/>
         </w:rPr>
-        <w:t xml:space="preserve">১১. Comparative Documentary Test এবং Inheritance (সোনাভানু আব্দুল করিমের উত্তরাধিকারী কি না—এটি একমাত্র প্রশ্ন নয়)</w:t>
+        <w:t xml:space="preserve">১১. ১৯৬৯ সালের correction theory-এর আরেকটি দুর্বলতা: কেন কেবল একজন? এবং Comparative Documentary Test</w:t>
       </w:r>
     </w:p>
     <w:p>
@@ -3237,6 +3237,142 @@
           <w:szCs w:val="20"/>
         </w:rPr>
         <w:t xml:space="preserve">এই comparative test কোনো inheritance right অস্বীকার করে না; বরং disputed parcel-এর identity নির্ধারণ করে। Genealogy alone cannot substitute for identification of the disputed holding.</w:t>
+      </w:r>
+    </w:p>
+    <w:p>
+      <w:r>
+        <w:rPr>
+          <w:rFonts w:ascii="Kalpurush" w:cs="Kalpurush" w:eastAsia="Kalpurush" w:hAnsi="Kalpurush"/>
+        </w:rPr>
+        <w:t xml:space="preserve"/>
+      </w:r>
+    </w:p>
+    <w:p>
+      <w:r>
+        <w:rPr>
+          <w:rFonts w:ascii="Kalpurush" w:cs="Kalpurush" w:eastAsia="Kalpurush" w:hAnsi="Kalpurush"/>
+          <w:sz w:val="20"/>
+          <w:szCs w:val="20"/>
+        </w:rPr>
+        <w:t xml:space="preserve">অধিকন্তু, বিবাদীপক্ষের succession theory অনুযায়ী আদালতের আরেকটি স্বাভাবিক প্রশ্ন:</w:t>
+      </w:r>
+    </w:p>
+    <w:p>
+      <w:r>
+        <w:rPr>
+          <w:rFonts w:ascii="Kalpurush" w:cs="Kalpurush" w:eastAsia="Kalpurush" w:hAnsi="Kalpurush"/>
+        </w:rPr>
+        <w:t xml:space="preserve"/>
+      </w:r>
+    </w:p>
+    <w:p>
+      <w:pPr>
+        <w:ind w:left="720"/>
+      </w:pPr>
+      <w:r>
+        <w:rPr>
+          <w:rFonts w:ascii="Kalpurush" w:cs="Kalpurush" w:eastAsia="Kalpurush" w:hAnsi="Kalpurush"/>
+          <w:i/>
+          <w:iCs/>
+          <w:sz w:val="20"/>
+          <w:szCs w:val="20"/>
+        </w:rPr>
+        <w:t xml:space="preserve">একই succession event-এর ফলে কেন কেবল সোনাভানুর নাম প্রতিফলিত হলো?</w:t>
+      </w:r>
+    </w:p>
+    <w:p>
+      <w:r>
+        <w:rPr>
+          <w:rFonts w:ascii="Kalpurush" w:cs="Kalpurush" w:eastAsia="Kalpurush" w:hAnsi="Kalpurush"/>
+        </w:rPr>
+        <w:t xml:space="preserve"/>
+      </w:r>
+    </w:p>
+    <w:p>
+      <w:r>
+        <w:rPr>
+          <w:rFonts w:ascii="Kalpurush" w:cs="Kalpurush" w:eastAsia="Kalpurush" w:hAnsi="Kalpurush"/>
+          <w:sz w:val="20"/>
+          <w:szCs w:val="20"/>
+        </w:rPr>
+        <w:t xml:space="preserve">বিশেষত যদি record ও pleadings অনুযায়ী অন্যান্য উত্তরাধিকারী/কন্যা বা তাঁদের successor-এর অস্তিত্ব থাকে।</w:t>
+      </w:r>
+    </w:p>
+    <w:p>
+      <w:r>
+        <w:rPr>
+          <w:rFonts w:ascii="Kalpurush" w:cs="Kalpurush" w:eastAsia="Kalpurush" w:hAnsi="Kalpurush"/>
+        </w:rPr>
+        <w:t xml:space="preserve"/>
+      </w:r>
+    </w:p>
+    <w:p>
+      <w:r>
+        <w:rPr>
+          <w:rFonts w:ascii="Kalpurush" w:cs="Kalpurush" w:eastAsia="Kalpurush" w:hAnsi="Kalpurush"/>
+          <w:sz w:val="20"/>
+          <w:szCs w:val="20"/>
+        </w:rPr>
+        <w:t xml:space="preserve">এখানে প্রশ্নটি সরাসরি inheritance determination নয়।</w:t>
+      </w:r>
+    </w:p>
+    <w:p>
+      <w:r>
+        <w:rPr>
+          <w:rFonts w:ascii="Kalpurush" w:cs="Kalpurush" w:eastAsia="Kalpurush" w:hAnsi="Kalpurush"/>
+        </w:rPr>
+        <w:t xml:space="preserve"/>
+      </w:r>
+    </w:p>
+    <w:p>
+      <w:r>
+        <w:rPr>
+          <w:rFonts w:ascii="Kalpurush" w:cs="Kalpurush" w:eastAsia="Kalpurush" w:hAnsi="Kalpurush"/>
+          <w:sz w:val="20"/>
+          <w:szCs w:val="20"/>
+        </w:rPr>
+        <w:t xml:space="preserve">প্রশ্নটি হলো:</w:t>
+      </w:r>
+    </w:p>
+    <w:p>
+      <w:r>
+        <w:rPr>
+          <w:rFonts w:ascii="Kalpurush" w:cs="Kalpurush" w:eastAsia="Kalpurush" w:hAnsi="Kalpurush"/>
+        </w:rPr>
+        <w:t xml:space="preserve"/>
+      </w:r>
+    </w:p>
+    <w:p>
+      <w:pPr>
+        <w:ind w:left="720"/>
+      </w:pPr>
+      <w:r>
+        <w:rPr>
+          <w:rFonts w:ascii="Kalpurush" w:cs="Kalpurush" w:eastAsia="Kalpurush" w:hAnsi="Kalpurush"/>
+          <w:i/>
+          <w:iCs/>
+          <w:sz w:val="20"/>
+          <w:szCs w:val="20"/>
+        </w:rPr>
+        <w:t xml:space="preserve">একটি কথিত judicial/official correction order-এর বাস্তবতা পরীক্ষা করার জন্য তার alleged result কি succession theory-এর সঙ্গে logically consistent?</w:t>
+      </w:r>
+    </w:p>
+    <w:p>
+      <w:r>
+        <w:rPr>
+          <w:rFonts w:ascii="Kalpurush" w:cs="Kalpurush" w:eastAsia="Kalpurush" w:hAnsi="Kalpurush"/>
+        </w:rPr>
+        <w:t xml:space="preserve"/>
+      </w:r>
+    </w:p>
+    <w:p>
+      <w:r>
+        <w:rPr>
+          <w:rFonts w:ascii="Kalpurush" w:cs="Kalpurush" w:eastAsia="Kalpurush" w:hAnsi="Kalpurush"/>
+          <w:sz w:val="20"/>
+          <w:szCs w:val="20"/>
+        </w:rPr>
+        <w:t xml:space="preserve">যদি না হয়, তাহলে missing parent order-এর গুরুত্ব আরও বৃদ্ধি পায়।</w:t>
       </w:r>
     </w:p>
     <w:p>

</xml_diff>